<commit_message>
Fix stale classical-QoI data for 5 cases in round-12 point 1 tables
The operator's own L2/H1/Energy/Reaction columns in Tables 18-R10q/s/u/w/y
were sourced from cached sweep files that predated the checkpoint-
fingerprint safety check and therefore reflected a pre-final-retrain
checkpoint -- the same class of bug already fixed for B1xNeo-Hookean.
Surfaced when Remaining5_LowN_Accuracy.ipynb's safety net discarded and
recomputed all five cases fresh, and the new N=13 numbers didn't match
what was already written in the Report.

Replaced all sixteen resolutions (not just the six previously "n/a") with
fresh, fingerprint-verified data for B1xMooney-Rivlin, B1xArruda-Boyce,
B2xNeo-Hookean, B2xMooney-Rivlin, and B2xArruda-Boyce. FEM and Cauchy-stress
columns were unaffected and untouched. Re-derived the Summary and side
document from the corrected Report.

Co-Authored-By: Claude Sonnet 5 <noreply@anthropic.com>
Claude-Session: https://claude.ai/code/session_01HX6Lr5YENQbEkvto9y2AB8
</commit_message>
<xml_diff>
--- a/advisor_feedback/PFEM_Work_Summary_2026-09-18b.docx
+++ b/advisor_feedback/PFEM_Work_Summary_2026-09-18b.docx
@@ -47,10 +47,7 @@
     </w:p>
     <w:p>
       <w:r>
-        <w:rPr>
-          <w:b w:val="0"/>
-        </w:rPr>
-        <w:t>A genuine, pre-existing gap, disclosed rather than hidden: the operator's own classical accuracy QoIs (L2, H1, energy, reaction) were never evaluated below N=13 for any case before this round -- its own zero-shot-validated range has always started there. B1xNeo-Hookean's own "Op." columns below are complete down to N=3 only because a dedicated follow-up run (2026-09-18, 46s of real GPU compute) closed that gap specifically for the flagship case; the other five cases still show "n/a" for the operator at N=3,4,5,6,9,11, an honest, unfilled gap rather than a guess. The Cauchy-stress metric, by contrast, is complete for every case at every resolution, since it was computed fresh in this round's own sweep regardless of any older cache.</w:t>
+        <w:t>This gap is now fully closed for every case. A first follow-up run (2026-09-18, 46s of GPU compute) closed it for the flagship B1xNeo-Hookean case alone; a second follow-up run, covering the other five cases together (6m30s total), closed the N=3,4,5,6,9,11 gap there too. That second run also revealed a real data-staleness bug worth stating plainly: its own checkpoint-fingerprint safety check found that the five cases' previously cached classical-QoI sweep files predated the fingerprint check entirely (i.e. were computed against an earlier, pre-final-retrain checkpoint) and discarded them, recomputing all sixteen resolutions fresh against the current final checkpoints -- the same class of bug already caught and fixed for B1xNeo-Hookean earlier in this project. The "Op." L2/H1/Energy/Reaction columns below are therefore now complete and checkpoint-verified for every case at all sixteen resolutions; some values differ from an earlier draft of this table as a direct result (e.g. B1xMooney-Rivlin at N=13: L2 was 7.39% against the stale cache, 10.48% against the verified final checkpoint). The Cauchy-stress metric was unaffected throughout, since it was always computed fresh in this round's own sweep regardless of any older cache.</w:t>
       </w:r>
     </w:p>
     <w:p>
@@ -3096,7 +3093,7 @@
           </w:tcPr>
           <w:p>
             <w:r>
-              <w:t>n/a</w:t>
+              <w:t>36.58%</w:t>
             </w:r>
           </w:p>
         </w:tc>
@@ -3116,7 +3113,7 @@
           </w:tcPr>
           <w:p>
             <w:r>
-              <w:t>n/a</w:t>
+              <w:t>70.38%</w:t>
             </w:r>
           </w:p>
         </w:tc>
@@ -3136,7 +3133,7 @@
           </w:tcPr>
           <w:p>
             <w:r>
-              <w:t>n/a</w:t>
+              <w:t>45.98%</w:t>
             </w:r>
           </w:p>
         </w:tc>
@@ -3156,7 +3153,7 @@
           </w:tcPr>
           <w:p>
             <w:r>
-              <w:t>n/a</w:t>
+              <w:t>9.43%</w:t>
             </w:r>
           </w:p>
         </w:tc>
@@ -3188,7 +3185,7 @@
           </w:tcPr>
           <w:p>
             <w:r>
-              <w:t>n/a</w:t>
+              <w:t>23.81%</w:t>
             </w:r>
           </w:p>
         </w:tc>
@@ -3208,7 +3205,7 @@
           </w:tcPr>
           <w:p>
             <w:r>
-              <w:t>n/a</w:t>
+              <w:t>47.93%</w:t>
             </w:r>
           </w:p>
         </w:tc>
@@ -3228,7 +3225,7 @@
           </w:tcPr>
           <w:p>
             <w:r>
-              <w:t>n/a</w:t>
+              <w:t>26.54%</w:t>
             </w:r>
           </w:p>
         </w:tc>
@@ -3248,7 +3245,7 @@
           </w:tcPr>
           <w:p>
             <w:r>
-              <w:t>n/a</w:t>
+              <w:t>2.51%</w:t>
             </w:r>
           </w:p>
         </w:tc>
@@ -3280,7 +3277,7 @@
           </w:tcPr>
           <w:p>
             <w:r>
-              <w:t>n/a</w:t>
+              <w:t>18.71%</w:t>
             </w:r>
           </w:p>
         </w:tc>
@@ -3300,7 +3297,7 @@
           </w:tcPr>
           <w:p>
             <w:r>
-              <w:t>n/a</w:t>
+              <w:t>36.63%</w:t>
             </w:r>
           </w:p>
         </w:tc>
@@ -3320,7 +3317,7 @@
           </w:tcPr>
           <w:p>
             <w:r>
-              <w:t>n/a</w:t>
+              <w:t>20.17%</w:t>
             </w:r>
           </w:p>
         </w:tc>
@@ -3340,7 +3337,7 @@
           </w:tcPr>
           <w:p>
             <w:r>
-              <w:t>n/a</w:t>
+              <w:t>1.05%</w:t>
             </w:r>
           </w:p>
         </w:tc>
@@ -3372,7 +3369,7 @@
           </w:tcPr>
           <w:p>
             <w:r>
-              <w:t>n/a</w:t>
+              <w:t>15.98%</w:t>
             </w:r>
           </w:p>
         </w:tc>
@@ -3392,7 +3389,7 @@
           </w:tcPr>
           <w:p>
             <w:r>
-              <w:t>n/a</w:t>
+              <w:t>33.10%</w:t>
             </w:r>
           </w:p>
         </w:tc>
@@ -3412,7 +3409,7 @@
           </w:tcPr>
           <w:p>
             <w:r>
-              <w:t>n/a</w:t>
+              <w:t>17.81%</w:t>
             </w:r>
           </w:p>
         </w:tc>
@@ -3432,7 +3429,7 @@
           </w:tcPr>
           <w:p>
             <w:r>
-              <w:t>n/a</w:t>
+              <w:t>3.37%</w:t>
             </w:r>
           </w:p>
         </w:tc>
@@ -3464,7 +3461,7 @@
           </w:tcPr>
           <w:p>
             <w:r>
-              <w:t>n/a</w:t>
+              <w:t>12.39%</w:t>
             </w:r>
           </w:p>
         </w:tc>
@@ -3484,7 +3481,7 @@
           </w:tcPr>
           <w:p>
             <w:r>
-              <w:t>n/a</w:t>
+              <w:t>26.17%</w:t>
             </w:r>
           </w:p>
         </w:tc>
@@ -3504,7 +3501,7 @@
           </w:tcPr>
           <w:p>
             <w:r>
-              <w:t>n/a</w:t>
+              <w:t>13.64%</w:t>
             </w:r>
           </w:p>
         </w:tc>
@@ -3524,7 +3521,7 @@
           </w:tcPr>
           <w:p>
             <w:r>
-              <w:t>n/a</w:t>
+              <w:t>3.84%</w:t>
             </w:r>
           </w:p>
         </w:tc>
@@ -3556,7 +3553,7 @@
           </w:tcPr>
           <w:p>
             <w:r>
-              <w:t>n/a</w:t>
+              <w:t>11.24%</w:t>
             </w:r>
           </w:p>
         </w:tc>
@@ -3576,7 +3573,7 @@
           </w:tcPr>
           <w:p>
             <w:r>
-              <w:t>n/a</w:t>
+              <w:t>23.90%</w:t>
             </w:r>
           </w:p>
         </w:tc>
@@ -3596,7 +3593,7 @@
           </w:tcPr>
           <w:p>
             <w:r>
-              <w:t>n/a</w:t>
+              <w:t>11.95%</w:t>
             </w:r>
           </w:p>
         </w:tc>
@@ -3616,7 +3613,7 @@
           </w:tcPr>
           <w:p>
             <w:r>
-              <w:t>n/a</w:t>
+              <w:t>3.35%</w:t>
             </w:r>
           </w:p>
         </w:tc>
@@ -3648,7 +3645,7 @@
           </w:tcPr>
           <w:p>
             <w:r>
-              <w:t>7.39%</w:t>
+              <w:t>10.48%</w:t>
             </w:r>
           </w:p>
         </w:tc>
@@ -3668,7 +3665,7 @@
           </w:tcPr>
           <w:p>
             <w:r>
-              <w:t>18.20%</w:t>
+              <w:t>22.12%</w:t>
             </w:r>
           </w:p>
         </w:tc>
@@ -3688,7 +3685,7 @@
           </w:tcPr>
           <w:p>
             <w:r>
-              <w:t>10.85%</w:t>
+              <w:t>10.94%</w:t>
             </w:r>
           </w:p>
         </w:tc>
@@ -3708,7 +3705,7 @@
           </w:tcPr>
           <w:p>
             <w:r>
-              <w:t>5.35%</w:t>
+              <w:t>3.00%</w:t>
             </w:r>
           </w:p>
         </w:tc>
@@ -3740,7 +3737,7 @@
           </w:tcPr>
           <w:p>
             <w:r>
-              <w:t>6.75%</w:t>
+              <w:t>9.54%</w:t>
             </w:r>
           </w:p>
         </w:tc>
@@ -3760,7 +3757,7 @@
           </w:tcPr>
           <w:p>
             <w:r>
-              <w:t>15.95%</w:t>
+              <w:t>19.62%</w:t>
             </w:r>
           </w:p>
         </w:tc>
@@ -3780,7 +3777,7 @@
           </w:tcPr>
           <w:p>
             <w:r>
-              <w:t>9.25%</w:t>
+              <w:t>9.43%</w:t>
             </w:r>
           </w:p>
         </w:tc>
@@ -3800,7 +3797,7 @@
           </w:tcPr>
           <w:p>
             <w:r>
-              <w:t>4.37%</w:t>
+              <w:t>2.39%</w:t>
             </w:r>
           </w:p>
         </w:tc>
@@ -3832,7 +3829,7 @@
           </w:tcPr>
           <w:p>
             <w:r>
-              <w:t>6.22%</w:t>
+              <w:t>8.93%</w:t>
             </w:r>
           </w:p>
         </w:tc>
@@ -3852,7 +3849,7 @@
           </w:tcPr>
           <w:p>
             <w:r>
-              <w:t>14.53%</w:t>
+              <w:t>17.82%</w:t>
             </w:r>
           </w:p>
         </w:tc>
@@ -3872,7 +3869,7 @@
           </w:tcPr>
           <w:p>
             <w:r>
-              <w:t>8.30%</w:t>
+              <w:t>8.43%</w:t>
             </w:r>
           </w:p>
         </w:tc>
@@ -3892,7 +3889,7 @@
           </w:tcPr>
           <w:p>
             <w:r>
-              <w:t>3.57%</w:t>
+              <w:t>1.94%</w:t>
             </w:r>
           </w:p>
         </w:tc>
@@ -3924,7 +3921,7 @@
           </w:tcPr>
           <w:p>
             <w:r>
-              <w:t>5.75%</w:t>
+              <w:t>8.50%</w:t>
             </w:r>
           </w:p>
         </w:tc>
@@ -3944,7 +3941,7 @@
           </w:tcPr>
           <w:p>
             <w:r>
-              <w:t>13.48%</w:t>
+              <w:t>16.45%</w:t>
             </w:r>
           </w:p>
         </w:tc>
@@ -3964,7 +3961,7 @@
           </w:tcPr>
           <w:p>
             <w:r>
-              <w:t>7.63%</w:t>
+              <w:t>7.69%</w:t>
             </w:r>
           </w:p>
         </w:tc>
@@ -3984,7 +3981,7 @@
           </w:tcPr>
           <w:p>
             <w:r>
-              <w:t>2.89%</w:t>
+              <w:t>1.54%</w:t>
             </w:r>
           </w:p>
         </w:tc>
@@ -4016,7 +4013,7 @@
           </w:tcPr>
           <w:p>
             <w:r>
-              <w:t>5.33%</w:t>
+              <w:t>8.18%</w:t>
             </w:r>
           </w:p>
         </w:tc>
@@ -4036,7 +4033,7 @@
           </w:tcPr>
           <w:p>
             <w:r>
-              <w:t>12.66%</w:t>
+              <w:t>15.36%</w:t>
             </w:r>
           </w:p>
         </w:tc>
@@ -4076,7 +4073,7 @@
           </w:tcPr>
           <w:p>
             <w:r>
-              <w:t>2.31%</w:t>
+              <w:t>1.24%</w:t>
             </w:r>
           </w:p>
         </w:tc>
@@ -4108,7 +4105,7 @@
           </w:tcPr>
           <w:p>
             <w:r>
-              <w:t>4.94%</w:t>
+              <w:t>7.92%</w:t>
             </w:r>
           </w:p>
         </w:tc>
@@ -4128,7 +4125,7 @@
           </w:tcPr>
           <w:p>
             <w:r>
-              <w:t>12.01%</w:t>
+              <w:t>14.48%</w:t>
             </w:r>
           </w:p>
         </w:tc>
@@ -4148,7 +4145,7 @@
           </w:tcPr>
           <w:p>
             <w:r>
-              <w:t>6.73%</w:t>
+              <w:t>6.68%</w:t>
             </w:r>
           </w:p>
         </w:tc>
@@ -4168,7 +4165,7 @@
           </w:tcPr>
           <w:p>
             <w:r>
-              <w:t>1.81%</w:t>
+              <w:t>0.99%</w:t>
             </w:r>
           </w:p>
         </w:tc>
@@ -4200,7 +4197,7 @@
           </w:tcPr>
           <w:p>
             <w:r>
-              <w:t>4.59%</w:t>
+              <w:t>7.71%</w:t>
             </w:r>
           </w:p>
         </w:tc>
@@ -4220,7 +4217,7 @@
           </w:tcPr>
           <w:p>
             <w:r>
-              <w:t>11.48%</w:t>
+              <w:t>13.74%</w:t>
             </w:r>
           </w:p>
         </w:tc>
@@ -4240,7 +4237,7 @@
           </w:tcPr>
           <w:p>
             <w:r>
-              <w:t>6.42%</w:t>
+              <w:t>6.32%</w:t>
             </w:r>
           </w:p>
         </w:tc>
@@ -4260,7 +4257,7 @@
           </w:tcPr>
           <w:p>
             <w:r>
-              <w:t>1.39%</w:t>
+              <w:t>0.80%</w:t>
             </w:r>
           </w:p>
         </w:tc>
@@ -4292,7 +4289,7 @@
           </w:tcPr>
           <w:p>
             <w:r>
-              <w:t>4.28%</w:t>
+              <w:t>7.52%</w:t>
             </w:r>
           </w:p>
         </w:tc>
@@ -4312,7 +4309,7 @@
           </w:tcPr>
           <w:p>
             <w:r>
-              <w:t>11.07%</w:t>
+              <w:t>13.12%</w:t>
             </w:r>
           </w:p>
         </w:tc>
@@ -4332,7 +4329,7 @@
           </w:tcPr>
           <w:p>
             <w:r>
-              <w:t>6.19%</w:t>
+              <w:t>6.03%</w:t>
             </w:r>
           </w:p>
         </w:tc>
@@ -4352,7 +4349,7 @@
           </w:tcPr>
           <w:p>
             <w:r>
-              <w:t>1.05%</w:t>
+              <w:t>0.67%</w:t>
             </w:r>
           </w:p>
         </w:tc>
@@ -4384,7 +4381,7 @@
           </w:tcPr>
           <w:p>
             <w:r>
-              <w:t>4.01%</w:t>
+              <w:t>7.36%</w:t>
             </w:r>
           </w:p>
         </w:tc>
@@ -4404,7 +4401,7 @@
           </w:tcPr>
           <w:p>
             <w:r>
-              <w:t>10.74%</w:t>
+              <w:t>12.59%</w:t>
             </w:r>
           </w:p>
         </w:tc>
@@ -4424,7 +4421,7 @@
           </w:tcPr>
           <w:p>
             <w:r>
-              <w:t>6.02%</w:t>
+              <w:t>5.80%</w:t>
             </w:r>
           </w:p>
         </w:tc>
@@ -4444,7 +4441,7 @@
           </w:tcPr>
           <w:p>
             <w:r>
-              <w:t>0.81%</w:t>
+              <w:t>0.63%</w:t>
             </w:r>
           </w:p>
         </w:tc>
@@ -4476,7 +4473,7 @@
           </w:tcPr>
           <w:p>
             <w:r>
-              <w:t>3.78%</w:t>
+              <w:t>7.22%</w:t>
             </w:r>
           </w:p>
         </w:tc>
@@ -4496,7 +4493,7 @@
           </w:tcPr>
           <w:p>
             <w:r>
-              <w:t>10.49%</w:t>
+              <w:t>12.13%</w:t>
             </w:r>
           </w:p>
         </w:tc>
@@ -4516,7 +4513,7 @@
           </w:tcPr>
           <w:p>
             <w:r>
-              <w:t>5.91%</w:t>
+              <w:t>5.61%</w:t>
             </w:r>
           </w:p>
         </w:tc>
@@ -4536,7 +4533,7 @@
           </w:tcPr>
           <w:p>
             <w:r>
-              <w:t>0.74%</w:t>
+              <w:t>0.66%</w:t>
             </w:r>
           </w:p>
         </w:tc>
@@ -5940,7 +5937,7 @@
           </w:tcPr>
           <w:p>
             <w:r>
-              <w:t>n/a</w:t>
+              <w:t>15.35%</w:t>
             </w:r>
           </w:p>
         </w:tc>
@@ -5960,7 +5957,7 @@
           </w:tcPr>
           <w:p>
             <w:r>
-              <w:t>n/a</w:t>
+              <w:t>35.77%</w:t>
             </w:r>
           </w:p>
         </w:tc>
@@ -5980,7 +5977,7 @@
           </w:tcPr>
           <w:p>
             <w:r>
-              <w:t>n/a</w:t>
+              <w:t>24.92%</w:t>
             </w:r>
           </w:p>
         </w:tc>
@@ -6000,7 +5997,7 @@
           </w:tcPr>
           <w:p>
             <w:r>
-              <w:t>n/a</w:t>
+              <w:t>9.94%</w:t>
             </w:r>
           </w:p>
         </w:tc>
@@ -6032,7 +6029,7 @@
           </w:tcPr>
           <w:p>
             <w:r>
-              <w:t>n/a</w:t>
+              <w:t>10.97%</w:t>
             </w:r>
           </w:p>
         </w:tc>
@@ -6052,7 +6049,7 @@
           </w:tcPr>
           <w:p>
             <w:r>
-              <w:t>n/a</w:t>
+              <w:t>29.51%</w:t>
             </w:r>
           </w:p>
         </w:tc>
@@ -6072,7 +6069,7 @@
           </w:tcPr>
           <w:p>
             <w:r>
-              <w:t>n/a</w:t>
+              <w:t>22.76%</w:t>
             </w:r>
           </w:p>
         </w:tc>
@@ -6092,7 +6089,7 @@
           </w:tcPr>
           <w:p>
             <w:r>
-              <w:t>n/a</w:t>
+              <w:t>4.21%</w:t>
             </w:r>
           </w:p>
         </w:tc>
@@ -6124,7 +6121,7 @@
           </w:tcPr>
           <w:p>
             <w:r>
-              <w:t>n/a</w:t>
+              <w:t>10.57%</w:t>
             </w:r>
           </w:p>
         </w:tc>
@@ -6144,7 +6141,7 @@
           </w:tcPr>
           <w:p>
             <w:r>
-              <w:t>n/a</w:t>
+              <w:t>24.56%</w:t>
             </w:r>
           </w:p>
         </w:tc>
@@ -6164,7 +6161,7 @@
           </w:tcPr>
           <w:p>
             <w:r>
-              <w:t>n/a</w:t>
+              <w:t>16.65%</w:t>
             </w:r>
           </w:p>
         </w:tc>
@@ -6184,7 +6181,7 @@
           </w:tcPr>
           <w:p>
             <w:r>
-              <w:t>n/a</w:t>
+              <w:t>8.81%</w:t>
             </w:r>
           </w:p>
         </w:tc>
@@ -6216,7 +6213,7 @@
           </w:tcPr>
           <w:p>
             <w:r>
-              <w:t>n/a</w:t>
+              <w:t>10.49%</w:t>
             </w:r>
           </w:p>
         </w:tc>
@@ -6236,7 +6233,7 @@
           </w:tcPr>
           <w:p>
             <w:r>
-              <w:t>n/a</w:t>
+              <w:t>23.35%</w:t>
             </w:r>
           </w:p>
         </w:tc>
@@ -6256,7 +6253,7 @@
           </w:tcPr>
           <w:p>
             <w:r>
-              <w:t>n/a</w:t>
+              <w:t>15.28%</w:t>
             </w:r>
           </w:p>
         </w:tc>
@@ -6276,7 +6273,7 @@
           </w:tcPr>
           <w:p>
             <w:r>
-              <w:t>n/a</w:t>
+              <w:t>9.37%</w:t>
             </w:r>
           </w:p>
         </w:tc>
@@ -6308,7 +6305,7 @@
           </w:tcPr>
           <w:p>
             <w:r>
-              <w:t>n/a</w:t>
+              <w:t>11.09%</w:t>
             </w:r>
           </w:p>
         </w:tc>
@@ -6328,7 +6325,7 @@
           </w:tcPr>
           <w:p>
             <w:r>
-              <w:t>n/a</w:t>
+              <w:t>23.74%</w:t>
             </w:r>
           </w:p>
         </w:tc>
@@ -6348,7 +6345,7 @@
           </w:tcPr>
           <w:p>
             <w:r>
-              <w:t>n/a</w:t>
+              <w:t>13.62%</w:t>
             </w:r>
           </w:p>
         </w:tc>
@@ -6368,7 +6365,7 @@
           </w:tcPr>
           <w:p>
             <w:r>
-              <w:t>n/a</w:t>
+              <w:t>9.47%</w:t>
             </w:r>
           </w:p>
         </w:tc>
@@ -6400,7 +6397,7 @@
           </w:tcPr>
           <w:p>
             <w:r>
-              <w:t>n/a</w:t>
+              <w:t>10.20%</w:t>
             </w:r>
           </w:p>
         </w:tc>
@@ -6420,7 +6417,7 @@
           </w:tcPr>
           <w:p>
             <w:r>
-              <w:t>n/a</w:t>
+              <w:t>22.44%</w:t>
             </w:r>
           </w:p>
         </w:tc>
@@ -6440,7 +6437,7 @@
           </w:tcPr>
           <w:p>
             <w:r>
-              <w:t>n/a</w:t>
+              <w:t>12.34%</w:t>
             </w:r>
           </w:p>
         </w:tc>
@@ -6460,7 +6457,7 @@
           </w:tcPr>
           <w:p>
             <w:r>
-              <w:t>n/a</w:t>
+              <w:t>8.11%</w:t>
             </w:r>
           </w:p>
         </w:tc>
@@ -6492,7 +6489,7 @@
           </w:tcPr>
           <w:p>
             <w:r>
-              <w:t>10.34%</w:t>
+              <w:t>9.30%</w:t>
             </w:r>
           </w:p>
         </w:tc>
@@ -6512,7 +6509,7 @@
           </w:tcPr>
           <w:p>
             <w:r>
-              <w:t>24.60%</w:t>
+              <w:t>20.92%</w:t>
             </w:r>
           </w:p>
         </w:tc>
@@ -6552,7 +6549,7 @@
           </w:tcPr>
           <w:p>
             <w:r>
-              <w:t>7.83%</w:t>
+              <w:t>6.91%</w:t>
             </w:r>
           </w:p>
         </w:tc>
@@ -6584,7 +6581,7 @@
           </w:tcPr>
           <w:p>
             <w:r>
-              <w:t>8.17%</w:t>
+              <w:t>7.76%</w:t>
             </w:r>
           </w:p>
         </w:tc>
@@ -6604,7 +6601,7 @@
           </w:tcPr>
           <w:p>
             <w:r>
-              <w:t>21.00%</w:t>
+              <w:t>17.94%</w:t>
             </w:r>
           </w:p>
         </w:tc>
@@ -6624,7 +6621,7 @@
           </w:tcPr>
           <w:p>
             <w:r>
-              <w:t>9.79%</w:t>
+              <w:t>9.68%</w:t>
             </w:r>
           </w:p>
         </w:tc>
@@ -6644,7 +6641,7 @@
           </w:tcPr>
           <w:p>
             <w:r>
-              <w:t>7.03%</w:t>
+              <w:t>5.26%</w:t>
             </w:r>
           </w:p>
         </w:tc>
@@ -6676,7 +6673,7 @@
           </w:tcPr>
           <w:p>
             <w:r>
-              <w:t>6.64%</w:t>
+              <w:t>6.77%</w:t>
             </w:r>
           </w:p>
         </w:tc>
@@ -6696,7 +6693,7 @@
           </w:tcPr>
           <w:p>
             <w:r>
-              <w:t>18.30%</w:t>
+              <w:t>15.50%</w:t>
             </w:r>
           </w:p>
         </w:tc>
@@ -6716,7 +6713,7 @@
           </w:tcPr>
           <w:p>
             <w:r>
-              <w:t>8.50%</w:t>
+              <w:t>8.39%</w:t>
             </w:r>
           </w:p>
         </w:tc>
@@ -6736,7 +6733,7 @@
           </w:tcPr>
           <w:p>
             <w:r>
-              <w:t>5.82%</w:t>
+              <w:t>4.24%</w:t>
             </w:r>
           </w:p>
         </w:tc>
@@ -6768,7 +6765,7 @@
           </w:tcPr>
           <w:p>
             <w:r>
-              <w:t>5.46%</w:t>
+              <w:t>6.16%</w:t>
             </w:r>
           </w:p>
         </w:tc>
@@ -6788,7 +6785,7 @@
           </w:tcPr>
           <w:p>
             <w:r>
-              <w:t>16.20%</w:t>
+              <w:t>13.72%</w:t>
             </w:r>
           </w:p>
         </w:tc>
@@ -6808,7 +6805,7 @@
           </w:tcPr>
           <w:p>
             <w:r>
-              <w:t>7.48%</w:t>
+              <w:t>7.44%</w:t>
             </w:r>
           </w:p>
         </w:tc>
@@ -6828,7 +6825,7 @@
           </w:tcPr>
           <w:p>
             <w:r>
-              <w:t>4.56%</w:t>
+              <w:t>3.62%</w:t>
             </w:r>
           </w:p>
         </w:tc>
@@ -6860,7 +6857,7 @@
           </w:tcPr>
           <w:p>
             <w:r>
-              <w:t>4.50%</w:t>
+              <w:t>5.77%</w:t>
             </w:r>
           </w:p>
         </w:tc>
@@ -6880,7 +6877,7 @@
           </w:tcPr>
           <w:p>
             <w:r>
-              <w:t>14.58%</w:t>
+              <w:t>12.42%</w:t>
             </w:r>
           </w:p>
         </w:tc>
@@ -6900,7 +6897,7 @@
           </w:tcPr>
           <w:p>
             <w:r>
-              <w:t>6.72%</w:t>
+              <w:t>6.73%</w:t>
             </w:r>
           </w:p>
         </w:tc>
@@ -6920,7 +6917,7 @@
           </w:tcPr>
           <w:p>
             <w:r>
-              <w:t>3.38%</w:t>
+              <w:t>3.23%</w:t>
             </w:r>
           </w:p>
         </w:tc>
@@ -6952,7 +6949,7 @@
           </w:tcPr>
           <w:p>
             <w:r>
-              <w:t>3.76%</w:t>
+              <w:t>5.52%</w:t>
             </w:r>
           </w:p>
         </w:tc>
@@ -6972,7 +6969,7 @@
           </w:tcPr>
           <w:p>
             <w:r>
-              <w:t>13.33%</w:t>
+              <w:t>11.47%</w:t>
             </w:r>
           </w:p>
         </w:tc>
@@ -6992,7 +6989,7 @@
           </w:tcPr>
           <w:p>
             <w:r>
-              <w:t>6.22%</w:t>
+              <w:t>6.19%</w:t>
             </w:r>
           </w:p>
         </w:tc>
@@ -7012,7 +7009,7 @@
           </w:tcPr>
           <w:p>
             <w:r>
-              <w:t>2.31%</w:t>
+              <w:t>2.99%</w:t>
             </w:r>
           </w:p>
         </w:tc>
@@ -7044,7 +7041,7 @@
           </w:tcPr>
           <w:p>
             <w:r>
-              <w:t>3.23%</w:t>
+              <w:t>5.36%</w:t>
             </w:r>
           </w:p>
         </w:tc>
@@ -7064,7 +7061,7 @@
           </w:tcPr>
           <w:p>
             <w:r>
-              <w:t>12.40%</w:t>
+              <w:t>10.77%</w:t>
             </w:r>
           </w:p>
         </w:tc>
@@ -7084,7 +7081,7 @@
           </w:tcPr>
           <w:p>
             <w:r>
-              <w:t>5.95%</w:t>
+              <w:t>5.79%</w:t>
             </w:r>
           </w:p>
         </w:tc>
@@ -7104,7 +7101,7 @@
           </w:tcPr>
           <w:p>
             <w:r>
-              <w:t>1.34%</w:t>
+              <w:t>2.82%</w:t>
             </w:r>
           </w:p>
         </w:tc>
@@ -7136,7 +7133,7 @@
           </w:tcPr>
           <w:p>
             <w:r>
-              <w:t>2.96%</w:t>
+              <w:t>5.25%</w:t>
             </w:r>
           </w:p>
         </w:tc>
@@ -7156,7 +7153,7 @@
           </w:tcPr>
           <w:p>
             <w:r>
-              <w:t>11.73%</w:t>
+              <w:t>10.24%</w:t>
             </w:r>
           </w:p>
         </w:tc>
@@ -7176,7 +7173,7 @@
           </w:tcPr>
           <w:p>
             <w:r>
-              <w:t>5.89%</w:t>
+              <w:t>5.49%</w:t>
             </w:r>
           </w:p>
         </w:tc>
@@ -7196,7 +7193,7 @@
           </w:tcPr>
           <w:p>
             <w:r>
-              <w:t>0.56%</w:t>
+              <w:t>2.69%</w:t>
             </w:r>
           </w:p>
         </w:tc>
@@ -7228,7 +7225,7 @@
           </w:tcPr>
           <w:p>
             <w:r>
-              <w:t>2.93%</w:t>
+              <w:t>5.18%</w:t>
             </w:r>
           </w:p>
         </w:tc>
@@ -7248,7 +7245,7 @@
           </w:tcPr>
           <w:p>
             <w:r>
-              <w:t>11.29%</w:t>
+              <w:t>9.84%</w:t>
             </w:r>
           </w:p>
         </w:tc>
@@ -7268,7 +7265,7 @@
           </w:tcPr>
           <w:p>
             <w:r>
-              <w:t>6.00%</w:t>
+              <w:t>5.25%</w:t>
             </w:r>
           </w:p>
         </w:tc>
@@ -7288,7 +7285,7 @@
           </w:tcPr>
           <w:p>
             <w:r>
-              <w:t>0.68%</w:t>
+              <w:t>2.58%</w:t>
             </w:r>
           </w:p>
         </w:tc>
@@ -7320,7 +7317,7 @@
           </w:tcPr>
           <w:p>
             <w:r>
-              <w:t>3.13%</w:t>
+              <w:t>5.13%</w:t>
             </w:r>
           </w:p>
         </w:tc>
@@ -7340,7 +7337,7 @@
           </w:tcPr>
           <w:p>
             <w:r>
-              <w:t>11.03%</w:t>
+              <w:t>9.52%</w:t>
             </w:r>
           </w:p>
         </w:tc>
@@ -7360,7 +7357,7 @@
           </w:tcPr>
           <w:p>
             <w:r>
-              <w:t>6.23%</w:t>
+              <w:t>5.07%</w:t>
             </w:r>
           </w:p>
         </w:tc>
@@ -7380,7 +7377,7 @@
           </w:tcPr>
           <w:p>
             <w:r>
-              <w:t>1.40%</w:t>
+              <w:t>2.50%</w:t>
             </w:r>
           </w:p>
         </w:tc>
@@ -8784,7 +8781,7 @@
           </w:tcPr>
           <w:p>
             <w:r>
-              <w:t>n/a</w:t>
+              <w:t>260.62%</w:t>
             </w:r>
           </w:p>
         </w:tc>
@@ -8804,7 +8801,7 @@
           </w:tcPr>
           <w:p>
             <w:r>
-              <w:t>n/a</w:t>
+              <w:t>246.00%</w:t>
             </w:r>
           </w:p>
         </w:tc>
@@ -8824,7 +8821,7 @@
           </w:tcPr>
           <w:p>
             <w:r>
-              <w:t>n/a</w:t>
+              <w:t>273.34%</w:t>
             </w:r>
           </w:p>
         </w:tc>
@@ -8876,7 +8873,7 @@
           </w:tcPr>
           <w:p>
             <w:r>
-              <w:t>n/a</w:t>
+              <w:t>213.38%</w:t>
             </w:r>
           </w:p>
         </w:tc>
@@ -8896,7 +8893,7 @@
           </w:tcPr>
           <w:p>
             <w:r>
-              <w:t>n/a</w:t>
+              <w:t>206.13%</w:t>
             </w:r>
           </w:p>
         </w:tc>
@@ -8916,7 +8913,7 @@
           </w:tcPr>
           <w:p>
             <w:r>
-              <w:t>n/a</w:t>
+              <w:t>214.67%</w:t>
             </w:r>
           </w:p>
         </w:tc>
@@ -8968,7 +8965,7 @@
           </w:tcPr>
           <w:p>
             <w:r>
-              <w:t>n/a</w:t>
+              <w:t>145.79%</w:t>
             </w:r>
           </w:p>
         </w:tc>
@@ -8988,7 +8985,7 @@
           </w:tcPr>
           <w:p>
             <w:r>
-              <w:t>n/a</w:t>
+              <w:t>141.55%</w:t>
             </w:r>
           </w:p>
         </w:tc>
@@ -9008,7 +9005,7 @@
           </w:tcPr>
           <w:p>
             <w:r>
-              <w:t>n/a</w:t>
+              <w:t>148.22%</w:t>
             </w:r>
           </w:p>
         </w:tc>
@@ -9060,7 +9057,7 @@
           </w:tcPr>
           <w:p>
             <w:r>
-              <w:t>n/a</w:t>
+              <w:t>133.02%</w:t>
             </w:r>
           </w:p>
         </w:tc>
@@ -9080,7 +9077,7 @@
           </w:tcPr>
           <w:p>
             <w:r>
-              <w:t>n/a</w:t>
+              <w:t>137.59%</w:t>
             </w:r>
           </w:p>
         </w:tc>
@@ -9100,7 +9097,7 @@
           </w:tcPr>
           <w:p>
             <w:r>
-              <w:t>n/a</w:t>
+              <w:t>131.64%</w:t>
             </w:r>
           </w:p>
         </w:tc>
@@ -9152,7 +9149,7 @@
           </w:tcPr>
           <w:p>
             <w:r>
-              <w:t>n/a</w:t>
+              <w:t>113.02%</w:t>
             </w:r>
           </w:p>
         </w:tc>
@@ -9172,7 +9169,7 @@
           </w:tcPr>
           <w:p>
             <w:r>
-              <w:t>n/a</w:t>
+              <w:t>113.29%</w:t>
             </w:r>
           </w:p>
         </w:tc>
@@ -9192,7 +9189,7 @@
           </w:tcPr>
           <w:p>
             <w:r>
-              <w:t>n/a</w:t>
+              <w:t>110.54%</w:t>
             </w:r>
           </w:p>
         </w:tc>
@@ -9244,7 +9241,7 @@
           </w:tcPr>
           <w:p>
             <w:r>
-              <w:t>n/a</w:t>
+              <w:t>81.11%</w:t>
             </w:r>
           </w:p>
         </w:tc>
@@ -9264,7 +9261,7 @@
           </w:tcPr>
           <w:p>
             <w:r>
-              <w:t>n/a</w:t>
+              <w:t>79.35%</w:t>
             </w:r>
           </w:p>
         </w:tc>
@@ -9284,7 +9281,7 @@
           </w:tcPr>
           <w:p>
             <w:r>
-              <w:t>n/a</w:t>
+              <w:t>80.58%</w:t>
             </w:r>
           </w:p>
         </w:tc>
@@ -9336,7 +9333,7 @@
           </w:tcPr>
           <w:p>
             <w:r>
-              <w:t>12.71%</w:t>
+              <w:t>53.33%</w:t>
             </w:r>
           </w:p>
         </w:tc>
@@ -9356,7 +9353,7 @@
           </w:tcPr>
           <w:p>
             <w:r>
-              <w:t>14.12%</w:t>
+              <w:t>52.43%</w:t>
             </w:r>
           </w:p>
         </w:tc>
@@ -9376,7 +9373,7 @@
           </w:tcPr>
           <w:p>
             <w:r>
-              <w:t>11.83%</w:t>
+              <w:t>51.55%</w:t>
             </w:r>
           </w:p>
         </w:tc>
@@ -9428,7 +9425,7 @@
           </w:tcPr>
           <w:p>
             <w:r>
-              <w:t>6.17%</w:t>
+              <w:t>16.72%</w:t>
             </w:r>
           </w:p>
         </w:tc>
@@ -9448,7 +9445,7 @@
           </w:tcPr>
           <w:p>
             <w:r>
-              <w:t>7.01%</w:t>
+              <w:t>18.29%</w:t>
             </w:r>
           </w:p>
         </w:tc>
@@ -9468,7 +9465,7 @@
           </w:tcPr>
           <w:p>
             <w:r>
-              <w:t>6.44%</w:t>
+              <w:t>16.61%</w:t>
             </w:r>
           </w:p>
         </w:tc>
@@ -9520,7 +9517,7 @@
           </w:tcPr>
           <w:p>
             <w:r>
-              <w:t>1.46%</w:t>
+              <w:t>6.05%</w:t>
             </w:r>
           </w:p>
         </w:tc>
@@ -9540,7 +9537,7 @@
           </w:tcPr>
           <w:p>
             <w:r>
-              <w:t>2.92%</w:t>
+              <w:t>11.87%</w:t>
             </w:r>
           </w:p>
         </w:tc>
@@ -9560,7 +9557,7 @@
           </w:tcPr>
           <w:p>
             <w:r>
-              <w:t>2.53%</w:t>
+              <w:t>8.32%</w:t>
             </w:r>
           </w:p>
         </w:tc>
@@ -9612,7 +9609,7 @@
           </w:tcPr>
           <w:p>
             <w:r>
-              <w:t>6.68%</w:t>
+              <w:t>14.35%</w:t>
             </w:r>
           </w:p>
         </w:tc>
@@ -9632,7 +9629,7 @@
           </w:tcPr>
           <w:p>
             <w:r>
-              <w:t>7.14%</w:t>
+              <w:t>18.55%</w:t>
             </w:r>
           </w:p>
         </w:tc>
@@ -9652,7 +9649,7 @@
           </w:tcPr>
           <w:p>
             <w:r>
-              <w:t>6.73%</w:t>
+              <w:t>15.87%</w:t>
             </w:r>
           </w:p>
         </w:tc>
@@ -9704,7 +9701,7 @@
           </w:tcPr>
           <w:p>
             <w:r>
-              <w:t>3.60%</w:t>
+              <w:t>3.85%</w:t>
             </w:r>
           </w:p>
         </w:tc>
@@ -9724,7 +9721,7 @@
           </w:tcPr>
           <w:p>
             <w:r>
-              <w:t>5.04%</w:t>
+              <w:t>9.83%</w:t>
             </w:r>
           </w:p>
         </w:tc>
@@ -9744,7 +9741,7 @@
           </w:tcPr>
           <w:p>
             <w:r>
-              <w:t>3.89%</w:t>
+              <w:t>6.82%</w:t>
             </w:r>
           </w:p>
         </w:tc>
@@ -9796,7 +9793,7 @@
           </w:tcPr>
           <w:p>
             <w:r>
-              <w:t>2.41%</w:t>
+              <w:t>4.44%</w:t>
             </w:r>
           </w:p>
         </w:tc>
@@ -9816,7 +9813,7 @@
           </w:tcPr>
           <w:p>
             <w:r>
-              <w:t>4.32%</w:t>
+              <w:t>9.96%</w:t>
             </w:r>
           </w:p>
         </w:tc>
@@ -9836,7 +9833,7 @@
           </w:tcPr>
           <w:p>
             <w:r>
-              <w:t>2.69%</w:t>
+              <w:t>6.51%</w:t>
             </w:r>
           </w:p>
         </w:tc>
@@ -9888,7 +9885,7 @@
           </w:tcPr>
           <w:p>
             <w:r>
-              <w:t>8.18%</w:t>
+              <w:t>7.96%</w:t>
             </w:r>
           </w:p>
         </w:tc>
@@ -9908,7 +9905,7 @@
           </w:tcPr>
           <w:p>
             <w:r>
-              <w:t>8.86%</w:t>
+              <w:t>13.06%</w:t>
             </w:r>
           </w:p>
         </w:tc>
@@ -9928,7 +9925,7 @@
           </w:tcPr>
           <w:p>
             <w:r>
-              <w:t>8.40%</w:t>
+              <w:t>8.26%</w:t>
             </w:r>
           </w:p>
         </w:tc>
@@ -9980,7 +9977,7 @@
           </w:tcPr>
           <w:p>
             <w:r>
-              <w:t>15.35%</w:t>
+              <w:t>9.78%</w:t>
             </w:r>
           </w:p>
         </w:tc>
@@ -10000,7 +9997,7 @@
           </w:tcPr>
           <w:p>
             <w:r>
-              <w:t>15.82%</w:t>
+              <w:t>15.17%</w:t>
             </w:r>
           </w:p>
         </w:tc>
@@ -10020,7 +10017,7 @@
           </w:tcPr>
           <w:p>
             <w:r>
-              <w:t>15.49%</w:t>
+              <w:t>9.45%</w:t>
             </w:r>
           </w:p>
         </w:tc>
@@ -10072,7 +10069,7 @@
           </w:tcPr>
           <w:p>
             <w:r>
-              <w:t>22.02%</w:t>
+              <w:t>11.55%</w:t>
             </w:r>
           </w:p>
         </w:tc>
@@ -10092,7 +10089,7 @@
           </w:tcPr>
           <w:p>
             <w:r>
-              <w:t>22.43%</w:t>
+              <w:t>17.91%</w:t>
             </w:r>
           </w:p>
         </w:tc>
@@ -10112,7 +10109,7 @@
           </w:tcPr>
           <w:p>
             <w:r>
-              <w:t>22.11%</w:t>
+              <w:t>8.50%</w:t>
             </w:r>
           </w:p>
         </w:tc>
@@ -10164,7 +10161,7 @@
           </w:tcPr>
           <w:p>
             <w:r>
-              <w:t>27.88%</w:t>
+              <w:t>18.96%</w:t>
             </w:r>
           </w:p>
         </w:tc>
@@ -10184,7 +10181,7 @@
           </w:tcPr>
           <w:p>
             <w:r>
-              <w:t>28.23%</w:t>
+              <w:t>26.02%</w:t>
             </w:r>
           </w:p>
         </w:tc>
@@ -10204,7 +10201,7 @@
           </w:tcPr>
           <w:p>
             <w:r>
-              <w:t>27.90%</w:t>
+              <w:t>11.70%</w:t>
             </w:r>
           </w:p>
         </w:tc>
@@ -11628,7 +11625,7 @@
           </w:tcPr>
           <w:p>
             <w:r>
-              <w:t>n/a</w:t>
+              <w:t>11.75%</w:t>
             </w:r>
           </w:p>
         </w:tc>
@@ -11648,7 +11645,7 @@
           </w:tcPr>
           <w:p>
             <w:r>
-              <w:t>n/a</w:t>
+              <w:t>32.96%</w:t>
             </w:r>
           </w:p>
         </w:tc>
@@ -11668,7 +11665,7 @@
           </w:tcPr>
           <w:p>
             <w:r>
-              <w:t>n/a</w:t>
+              <w:t>32.05%</w:t>
             </w:r>
           </w:p>
         </w:tc>
@@ -11720,7 +11717,7 @@
           </w:tcPr>
           <w:p>
             <w:r>
-              <w:t>n/a</w:t>
+              <w:t>9.29%</w:t>
             </w:r>
           </w:p>
         </w:tc>
@@ -11740,7 +11737,7 @@
           </w:tcPr>
           <w:p>
             <w:r>
-              <w:t>n/a</w:t>
+              <w:t>30.45%</w:t>
             </w:r>
           </w:p>
         </w:tc>
@@ -11760,7 +11757,7 @@
           </w:tcPr>
           <w:p>
             <w:r>
-              <w:t>n/a</w:t>
+              <w:t>29.95%</w:t>
             </w:r>
           </w:p>
         </w:tc>
@@ -11812,7 +11809,7 @@
           </w:tcPr>
           <w:p>
             <w:r>
-              <w:t>n/a</w:t>
+              <w:t>9.99%</w:t>
             </w:r>
           </w:p>
         </w:tc>
@@ -11832,7 +11829,7 @@
           </w:tcPr>
           <w:p>
             <w:r>
-              <w:t>n/a</w:t>
+              <w:t>31.57%</w:t>
             </w:r>
           </w:p>
         </w:tc>
@@ -11852,7 +11849,7 @@
           </w:tcPr>
           <w:p>
             <w:r>
-              <w:t>n/a</w:t>
+              <w:t>29.89%</w:t>
             </w:r>
           </w:p>
         </w:tc>
@@ -11904,7 +11901,7 @@
           </w:tcPr>
           <w:p>
             <w:r>
-              <w:t>n/a</w:t>
+              <w:t>10.66%</w:t>
             </w:r>
           </w:p>
         </w:tc>
@@ -11924,7 +11921,7 @@
           </w:tcPr>
           <w:p>
             <w:r>
-              <w:t>n/a</w:t>
+              <w:t>32.19%</w:t>
             </w:r>
           </w:p>
         </w:tc>
@@ -11944,7 +11941,7 @@
           </w:tcPr>
           <w:p>
             <w:r>
-              <w:t>n/a</w:t>
+              <w:t>29.43%</w:t>
             </w:r>
           </w:p>
         </w:tc>
@@ -11996,7 +11993,7 @@
           </w:tcPr>
           <w:p>
             <w:r>
-              <w:t>n/a</w:t>
+              <w:t>11.71%</w:t>
             </w:r>
           </w:p>
         </w:tc>
@@ -12016,7 +12013,7 @@
           </w:tcPr>
           <w:p>
             <w:r>
-              <w:t>n/a</w:t>
+              <w:t>33.39%</w:t>
             </w:r>
           </w:p>
         </w:tc>
@@ -12036,7 +12033,7 @@
           </w:tcPr>
           <w:p>
             <w:r>
-              <w:t>n/a</w:t>
+              <w:t>28.89%</w:t>
             </w:r>
           </w:p>
         </w:tc>
@@ -12088,7 +12085,7 @@
           </w:tcPr>
           <w:p>
             <w:r>
-              <w:t>n/a</w:t>
+              <w:t>12.07%</w:t>
             </w:r>
           </w:p>
         </w:tc>
@@ -12108,7 +12105,7 @@
           </w:tcPr>
           <w:p>
             <w:r>
-              <w:t>n/a</w:t>
+              <w:t>33.73%</w:t>
             </w:r>
           </w:p>
         </w:tc>
@@ -12128,7 +12125,7 @@
           </w:tcPr>
           <w:p>
             <w:r>
-              <w:t>n/a</w:t>
+              <w:t>28.49%</w:t>
             </w:r>
           </w:p>
         </w:tc>
@@ -12180,7 +12177,7 @@
           </w:tcPr>
           <w:p>
             <w:r>
-              <w:t>10.46%</w:t>
+              <w:t>12.22%</w:t>
             </w:r>
           </w:p>
         </w:tc>
@@ -12200,7 +12197,7 @@
           </w:tcPr>
           <w:p>
             <w:r>
-              <w:t>13.65%</w:t>
+              <w:t>33.85%</w:t>
             </w:r>
           </w:p>
         </w:tc>
@@ -12220,7 +12217,7 @@
           </w:tcPr>
           <w:p>
             <w:r>
-              <w:t>11.32%</w:t>
+              <w:t>28.27%</w:t>
             </w:r>
           </w:p>
         </w:tc>
@@ -12272,7 +12269,7 @@
           </w:tcPr>
           <w:p>
             <w:r>
-              <w:t>4.21%</w:t>
+              <w:t>12.43%</w:t>
             </w:r>
           </w:p>
         </w:tc>
@@ -12292,7 +12289,7 @@
           </w:tcPr>
           <w:p>
             <w:r>
-              <w:t>7.39%</w:t>
+              <w:t>34.00%</w:t>
             </w:r>
           </w:p>
         </w:tc>
@@ -12312,7 +12309,7 @@
           </w:tcPr>
           <w:p>
             <w:r>
-              <w:t>6.23%</w:t>
+              <w:t>27.98%</w:t>
             </w:r>
           </w:p>
         </w:tc>
@@ -12364,7 +12361,7 @@
           </w:tcPr>
           <w:p>
             <w:r>
-              <w:t>3.08%</w:t>
+              <w:t>12.53%</w:t>
             </w:r>
           </w:p>
         </w:tc>
@@ -12384,7 +12381,7 @@
           </w:tcPr>
           <w:p>
             <w:r>
-              <w:t>5.22%</w:t>
+              <w:t>34.11%</w:t>
             </w:r>
           </w:p>
         </w:tc>
@@ -12404,7 +12401,7 @@
           </w:tcPr>
           <w:p>
             <w:r>
-              <w:t>4.89%</w:t>
+              <w:t>27.85%</w:t>
             </w:r>
           </w:p>
         </w:tc>
@@ -12456,7 +12453,7 @@
           </w:tcPr>
           <w:p>
             <w:r>
-              <w:t>3.99%</w:t>
+              <w:t>12.59%</w:t>
             </w:r>
           </w:p>
         </w:tc>
@@ -12476,7 +12473,7 @@
           </w:tcPr>
           <w:p>
             <w:r>
-              <w:t>6.22%</w:t>
+              <w:t>34.16%</w:t>
             </w:r>
           </w:p>
         </w:tc>
@@ -12496,7 +12493,7 @@
           </w:tcPr>
           <w:p>
             <w:r>
-              <w:t>5.65%</w:t>
+              <w:t>27.78%</w:t>
             </w:r>
           </w:p>
         </w:tc>
@@ -12548,7 +12545,7 @@
           </w:tcPr>
           <w:p>
             <w:r>
-              <w:t>7.21%</w:t>
+              <w:t>12.62%</w:t>
             </w:r>
           </w:p>
         </w:tc>
@@ -12568,7 +12565,7 @@
           </w:tcPr>
           <w:p>
             <w:r>
-              <w:t>10.94%</w:t>
+              <w:t>34.19%</w:t>
             </w:r>
           </w:p>
         </w:tc>
@@ -12588,7 +12585,7 @@
           </w:tcPr>
           <w:p>
             <w:r>
-              <w:t>8.86%</w:t>
+              <w:t>27.73%</w:t>
             </w:r>
           </w:p>
         </w:tc>
@@ -12640,7 +12637,7 @@
           </w:tcPr>
           <w:p>
             <w:r>
-              <w:t>5.09%</w:t>
+              <w:t>12.65%</w:t>
             </w:r>
           </w:p>
         </w:tc>
@@ -12660,7 +12657,7 @@
           </w:tcPr>
           <w:p>
             <w:r>
-              <w:t>6.61%</w:t>
+              <w:t>34.21%</w:t>
             </w:r>
           </w:p>
         </w:tc>
@@ -12680,7 +12677,7 @@
           </w:tcPr>
           <w:p>
             <w:r>
-              <w:t>6.19%</w:t>
+              <w:t>27.71%</w:t>
             </w:r>
           </w:p>
         </w:tc>
@@ -12732,7 +12729,7 @@
           </w:tcPr>
           <w:p>
             <w:r>
-              <w:t>12.96%</w:t>
+              <w:t>12.67%</w:t>
             </w:r>
           </w:p>
         </w:tc>
@@ -12752,7 +12749,7 @@
           </w:tcPr>
           <w:p>
             <w:r>
-              <w:t>11.60%</w:t>
+              <w:t>34.23%</w:t>
             </w:r>
           </w:p>
         </w:tc>
@@ -12772,7 +12769,7 @@
           </w:tcPr>
           <w:p>
             <w:r>
-              <w:t>12.89%</w:t>
+              <w:t>27.70%</w:t>
             </w:r>
           </w:p>
         </w:tc>
@@ -12824,7 +12821,7 @@
           </w:tcPr>
           <w:p>
             <w:r>
-              <w:t>19.90%</w:t>
+              <w:t>12.68%</w:t>
             </w:r>
           </w:p>
         </w:tc>
@@ -12844,7 +12841,7 @@
           </w:tcPr>
           <w:p>
             <w:r>
-              <w:t>17.77%</w:t>
+              <w:t>34.24%</w:t>
             </w:r>
           </w:p>
         </w:tc>
@@ -12864,7 +12861,7 @@
           </w:tcPr>
           <w:p>
             <w:r>
-              <w:t>19.45%</w:t>
+              <w:t>27.69%</w:t>
             </w:r>
           </w:p>
         </w:tc>
@@ -12916,7 +12913,7 @@
           </w:tcPr>
           <w:p>
             <w:r>
-              <w:t>26.04%</w:t>
+              <w:t>12.69%</w:t>
             </w:r>
           </w:p>
         </w:tc>
@@ -12936,7 +12933,7 @@
           </w:tcPr>
           <w:p>
             <w:r>
-              <w:t>23.51%</w:t>
+              <w:t>34.25%</w:t>
             </w:r>
           </w:p>
         </w:tc>
@@ -12956,7 +12953,7 @@
           </w:tcPr>
           <w:p>
             <w:r>
-              <w:t>25.36%</w:t>
+              <w:t>27.69%</w:t>
             </w:r>
           </w:p>
         </w:tc>
@@ -13008,7 +13005,7 @@
           </w:tcPr>
           <w:p>
             <w:r>
-              <w:t>31.36%</w:t>
+              <w:t>12.70%</w:t>
             </w:r>
           </w:p>
         </w:tc>
@@ -13028,7 +13025,7 @@
           </w:tcPr>
           <w:p>
             <w:r>
-              <w:t>28.63%</w:t>
+              <w:t>34.26%</w:t>
             </w:r>
           </w:p>
         </w:tc>
@@ -13048,7 +13045,7 @@
           </w:tcPr>
           <w:p>
             <w:r>
-              <w:t>30.54%</w:t>
+              <w:t>27.68%</w:t>
             </w:r>
           </w:p>
         </w:tc>
@@ -14472,7 +14469,7 @@
           </w:tcPr>
           <w:p>
             <w:r>
-              <w:t>n/a</w:t>
+              <w:t>156.68%</w:t>
             </w:r>
           </w:p>
         </w:tc>
@@ -14492,7 +14489,7 @@
           </w:tcPr>
           <w:p>
             <w:r>
-              <w:t>n/a</w:t>
+              <w:t>196.93%</w:t>
             </w:r>
           </w:p>
         </w:tc>
@@ -14512,7 +14509,7 @@
           </w:tcPr>
           <w:p>
             <w:r>
-              <w:t>n/a</w:t>
+              <w:t>189.65%</w:t>
             </w:r>
           </w:p>
         </w:tc>
@@ -14564,7 +14561,7 @@
           </w:tcPr>
           <w:p>
             <w:r>
-              <w:t>n/a</w:t>
+              <w:t>126.27%</w:t>
             </w:r>
           </w:p>
         </w:tc>
@@ -14584,7 +14581,7 @@
           </w:tcPr>
           <w:p>
             <w:r>
-              <w:t>n/a</w:t>
+              <w:t>234.08%</w:t>
             </w:r>
           </w:p>
         </w:tc>
@@ -14604,7 +14601,7 @@
           </w:tcPr>
           <w:p>
             <w:r>
-              <w:t>n/a</w:t>
+              <w:t>244.61%</w:t>
             </w:r>
           </w:p>
         </w:tc>
@@ -14656,7 +14653,7 @@
           </w:tcPr>
           <w:p>
             <w:r>
-              <w:t>n/a</w:t>
+              <w:t>64.57%</w:t>
             </w:r>
           </w:p>
         </w:tc>
@@ -14676,7 +14673,7 @@
           </w:tcPr>
           <w:p>
             <w:r>
-              <w:t>n/a</w:t>
+              <w:t>81.42%</w:t>
             </w:r>
           </w:p>
         </w:tc>
@@ -14696,7 +14693,7 @@
           </w:tcPr>
           <w:p>
             <w:r>
-              <w:t>n/a</w:t>
+              <w:t>61.71%</w:t>
             </w:r>
           </w:p>
         </w:tc>
@@ -14748,7 +14745,7 @@
           </w:tcPr>
           <w:p>
             <w:r>
-              <w:t>n/a</w:t>
+              <w:t>79.22%</w:t>
             </w:r>
           </w:p>
         </w:tc>
@@ -14768,7 +14765,7 @@
           </w:tcPr>
           <w:p>
             <w:r>
-              <w:t>n/a</w:t>
+              <w:t>90.96%</w:t>
             </w:r>
           </w:p>
         </w:tc>
@@ -14788,7 +14785,7 @@
           </w:tcPr>
           <w:p>
             <w:r>
-              <w:t>n/a</w:t>
+              <w:t>75.46%</w:t>
             </w:r>
           </w:p>
         </w:tc>
@@ -14840,7 +14837,7 @@
           </w:tcPr>
           <w:p>
             <w:r>
-              <w:t>n/a</w:t>
+              <w:t>30.51%</w:t>
             </w:r>
           </w:p>
         </w:tc>
@@ -14860,7 +14857,7 @@
           </w:tcPr>
           <w:p>
             <w:r>
-              <w:t>n/a</w:t>
+              <w:t>37.12%</w:t>
             </w:r>
           </w:p>
         </w:tc>
@@ -14880,7 +14877,7 @@
           </w:tcPr>
           <w:p>
             <w:r>
-              <w:t>n/a</w:t>
+              <w:t>30.41%</w:t>
             </w:r>
           </w:p>
         </w:tc>
@@ -14932,7 +14929,7 @@
           </w:tcPr>
           <w:p>
             <w:r>
-              <w:t>n/a</w:t>
+              <w:t>26.89%</w:t>
             </w:r>
           </w:p>
         </w:tc>
@@ -14952,7 +14949,7 @@
           </w:tcPr>
           <w:p>
             <w:r>
-              <w:t>n/a</w:t>
+              <w:t>32.42%</w:t>
             </w:r>
           </w:p>
         </w:tc>
@@ -14972,7 +14969,7 @@
           </w:tcPr>
           <w:p>
             <w:r>
-              <w:t>n/a</w:t>
+              <w:t>25.34%</w:t>
             </w:r>
           </w:p>
         </w:tc>
@@ -17167,10 +17164,7 @@
     </w:tbl>
     <w:p>
       <w:r>
-        <w:rPr>
-          <w:b w:val="0"/>
-        </w:rPr>
-        <w:t>Two findings worth stating plainly. First, the true max is markedly noisier and slower-converging than the region average for BOTH methods and every case -- B1xNeo-Hookean's own FEM region average falls to 0.30% by N=49 (displacement L2 is already down to 0.05% there), while its FEM true max is still 62.8% at N=3 and only reaches 26.5% at N=49 -- a real, data-grounded illustration of exactly why the advisor asked to avoid the bare pointwise maximum as the primary design QoI: even FEM's own true max, with no operator involved at all, converges far more slowly than the region-averaged statistic he asked to use instead. Second, the operator's own region-averaged stress error is consistently worse than its displacement L2 error at matched resolution (e.g. B1xMooney-Rivlin at N=13: L2 7.39% vs. region average 10.69%) -- stress is a genuinely harder, noisier target for the operator than displacement, not merely a rescaled version of the same accuracy. B2xNeo-Hookean is the extreme case: its operator's own region-averaged stress error reaches 245.59% at N=3 and stays in the 3.2%-245.6% range across the whole sweep, never settling anywhere close to FEM's own sub-1% region average at the same resolutions -- confirming that displacement accuracy alone should not be treated as a stand-in for stress accuracy.</w:t>
+        <w:t>Two findings worth stating plainly. First, the true max is markedly noisier and slower-converging than the region average for BOTH methods and every case -- B1xNeo-Hookean's own FEM region average falls to 0.30% by N=49 (displacement L2 is already down to 0.05% there), while its FEM true max is still 62.8% at N=3 and only reaches 26.5% at N=49 -- a real, data-grounded illustration of exactly why the advisor asked to avoid the bare pointwise maximum as the primary design QoI: even FEM's own true max, with no operator involved at all, converges far more slowly than the region-averaged statistic he asked to use instead. Second, the operator's own region-averaged stress error is consistently worse than its displacement L2 error at matched resolution (e.g. B1xMooney-Rivlin at N=13: L2 10.48% vs. region average 10.69%) -- stress is a genuinely harder, noisier target for the operator than displacement, not merely a rescaled version of the same accuracy. B2xNeo-Hookean is the extreme case: its operator's own region-averaged stress error reaches 245.59% at N=3 and stays in the 3.2%-245.6% range across the whole sweep, never settling anywhere close to FEM's own sub-1% region average at the same resolutions -- confirming that displacement accuracy alone should not be treated as a stand-in for stress accuracy.</w:t>
       </w:r>
     </w:p>
     <w:p>

</xml_diff>